<commit_message>
Fix Korean font rendering in Word document
Set w:rFonts eastAsia attribute to properly map Korean glyphs.
ascii/hAnsi = "Malgun Gothic", eastAsia = "맑은 고딕" for all runs.

https://claude.ai/code/session_015ecDEnTte7dVRDWpne5cgc
</commit_message>
<xml_diff>
--- a/docs/spatial_attention_references.docx
+++ b/docs/spatial_attention_references.docx
@@ -14,6 +14,7 @@
       </w:pPr>
       <w:r>
         <w:rPr>
+          <w:rFonts w:ascii="Malgun Gothic" w:hAnsi="Malgun Gothic" w:eastAsia="맑은 고딕" w:cs="Malgun Gothic"/>
           <w:b/>
           <w:color w:val="1A1A2E"/>
           <w:sz w:val="44"/>
@@ -30,6 +31,7 @@
       </w:pPr>
       <w:r>
         <w:rPr>
+          <w:rFonts w:ascii="Malgun Gothic" w:hAnsi="Malgun Gothic" w:eastAsia="맑은 고딕" w:cs="Malgun Gothic"/>
           <w:color w:val="555577"/>
           <w:sz w:val="28"/>
         </w:rPr>
@@ -44,6 +46,7 @@
       </w:pPr>
       <w:r>
         <w:rPr>
+          <w:rFonts w:ascii="Malgun Gothic" w:hAnsi="Malgun Gothic" w:eastAsia="맑은 고딕" w:cs="Malgun Gothic"/>
           <w:color w:val="777777"/>
           <w:sz w:val="22"/>
         </w:rPr>
@@ -278,6 +281,7 @@
             <w:r/>
             <w:r>
               <w:rPr>
+                <w:rFonts w:ascii="Malgun Gothic" w:hAnsi="Malgun Gothic" w:eastAsia="맑은 고딕" w:cs="Malgun Gothic"/>
                 <w:b/>
                 <w:color w:val="FFFFFF"/>
                 <w:sz w:val="18"/>
@@ -298,6 +302,7 @@
             <w:r/>
             <w:r>
               <w:rPr>
+                <w:rFonts w:ascii="Malgun Gothic" w:hAnsi="Malgun Gothic" w:eastAsia="맑은 고딕" w:cs="Malgun Gothic"/>
                 <w:b/>
                 <w:color w:val="FFFFFF"/>
                 <w:sz w:val="18"/>
@@ -318,6 +323,7 @@
             <w:r/>
             <w:r>
               <w:rPr>
+                <w:rFonts w:ascii="Malgun Gothic" w:hAnsi="Malgun Gothic" w:eastAsia="맑은 고딕" w:cs="Malgun Gothic"/>
                 <w:b/>
                 <w:color w:val="FFFFFF"/>
                 <w:sz w:val="18"/>
@@ -336,6 +342,7 @@
             <w:r/>
             <w:r>
               <w:rPr>
+                <w:rFonts w:ascii="Malgun Gothic" w:hAnsi="Malgun Gothic" w:eastAsia="맑은 고딕" w:cs="Malgun Gothic"/>
                 <w:sz w:val="18"/>
               </w:rPr>
               <w:t>공간 정보 처리</w:t>
@@ -350,6 +357,7 @@
             <w:r/>
             <w:r>
               <w:rPr>
+                <w:rFonts w:ascii="Malgun Gothic" w:hAnsi="Malgun Gothic" w:eastAsia="맑은 고딕" w:cs="Malgun Gothic"/>
                 <w:sz w:val="18"/>
               </w:rPr>
               <w:t>AdaptiveAvgPool → 공간 정보 완전 압축</w:t>
@@ -364,6 +372,7 @@
             <w:r/>
             <w:r>
               <w:rPr>
+                <w:rFonts w:ascii="Malgun Gothic" w:hAnsi="Malgun Gothic" w:eastAsia="맑은 고딕" w:cs="Malgun Gothic"/>
                 <w:sz w:val="18"/>
               </w:rPr>
               <w:t>클래스별 Attention Map → 공간 위치 보존</w:t>
@@ -381,6 +390,7 @@
             <w:r/>
             <w:r>
               <w:rPr>
+                <w:rFonts w:ascii="Malgun Gothic" w:hAnsi="Malgun Gothic" w:eastAsia="맑은 고딕" w:cs="Malgun Gothic"/>
                 <w:sz w:val="18"/>
               </w:rPr>
               <w:t>분류 방식</w:t>
@@ -396,6 +406,7 @@
             <w:r/>
             <w:r>
               <w:rPr>
+                <w:rFonts w:ascii="Malgun Gothic" w:hAnsi="Malgun Gothic" w:eastAsia="맑은 고딕" w:cs="Malgun Gothic"/>
                 <w:sz w:val="18"/>
               </w:rPr>
               <w:t>단일 FC → 전체 클래스 동시 출력</w:t>
@@ -411,6 +422,7 @@
             <w:r/>
             <w:r>
               <w:rPr>
+                <w:rFonts w:ascii="Malgun Gothic" w:hAnsi="Malgun Gothic" w:eastAsia="맑은 고딕" w:cs="Malgun Gothic"/>
                 <w:sz w:val="18"/>
               </w:rPr>
               <w:t>클래스별 독립 FC → 개별 판단</w:t>
@@ -427,6 +439,7 @@
             <w:r/>
             <w:r>
               <w:rPr>
+                <w:rFonts w:ascii="Malgun Gothic" w:hAnsi="Malgun Gothic" w:eastAsia="맑은 고딕" w:cs="Malgun Gothic"/>
                 <w:sz w:val="18"/>
               </w:rPr>
               <w:t>중첩 대응</w:t>
@@ -441,6 +454,7 @@
             <w:r/>
             <w:r>
               <w:rPr>
+                <w:rFonts w:ascii="Malgun Gothic" w:hAnsi="Malgun Gothic" w:eastAsia="맑은 고딕" w:cs="Malgun Gothic"/>
                 <w:sz w:val="18"/>
               </w:rPr>
               <w:t>특징 혼합으로 중첩 시 혼동</w:t>
@@ -455,6 +469,7 @@
             <w:r/>
             <w:r>
               <w:rPr>
+                <w:rFonts w:ascii="Malgun Gothic" w:hAnsi="Malgun Gothic" w:eastAsia="맑은 고딕" w:cs="Malgun Gothic"/>
                 <w:sz w:val="18"/>
               </w:rPr>
               <w:t>공간 분리로 독립 탐지</w:t>
@@ -472,6 +487,7 @@
             <w:r/>
             <w:r>
               <w:rPr>
+                <w:rFonts w:ascii="Malgun Gothic" w:hAnsi="Malgun Gothic" w:eastAsia="맑은 고딕" w:cs="Malgun Gothic"/>
                 <w:sz w:val="18"/>
               </w:rPr>
               <w:t>파라미터 수</w:t>
@@ -487,6 +503,7 @@
             <w:r/>
             <w:r>
               <w:rPr>
+                <w:rFonts w:ascii="Malgun Gothic" w:hAnsi="Malgun Gothic" w:eastAsia="맑은 고딕" w:cs="Malgun Gothic"/>
                 <w:sz w:val="18"/>
               </w:rPr>
               <w:t>~406K</w:t>
@@ -502,6 +519,7 @@
             <w:r/>
             <w:r>
               <w:rPr>
+                <w:rFonts w:ascii="Malgun Gothic" w:hAnsi="Malgun Gothic" w:eastAsia="맑은 고딕" w:cs="Malgun Gothic"/>
                 <w:sz w:val="18"/>
               </w:rPr>
               <w:t>~620K</w:t>
@@ -518,6 +536,7 @@
             <w:r/>
             <w:r>
               <w:rPr>
+                <w:rFonts w:ascii="Malgun Gothic" w:hAnsi="Malgun Gothic" w:eastAsia="맑은 고딕" w:cs="Malgun Gothic"/>
                 <w:sz w:val="18"/>
               </w:rPr>
               <w:t>해석 가능성</w:t>
@@ -532,6 +551,7 @@
             <w:r/>
             <w:r>
               <w:rPr>
+                <w:rFonts w:ascii="Malgun Gothic" w:hAnsi="Malgun Gothic" w:eastAsia="맑은 고딕" w:cs="Malgun Gothic"/>
                 <w:sz w:val="18"/>
               </w:rPr>
               <w:t>Post-hoc (Grad-CAM 필요)</w:t>
@@ -546,6 +566,7 @@
             <w:r/>
             <w:r>
               <w:rPr>
+                <w:rFonts w:ascii="Malgun Gothic" w:hAnsi="Malgun Gothic" w:eastAsia="맑은 고딕" w:cs="Malgun Gothic"/>
                 <w:sz w:val="18"/>
               </w:rPr>
               <w:t>Built-in (Attention Map 직접 출력)</w:t>
@@ -558,6 +579,7 @@
     <w:p>
       <w:r>
         <w:rPr>
+          <w:rFonts w:ascii="Malgun Gothic" w:hAnsi="Malgun Gothic" w:eastAsia="맑은 고딕" w:cs="Malgun Gothic"/>
           <w:i/>
           <w:sz w:val="18"/>
         </w:rPr>
@@ -612,6 +634,7 @@
             <w:r/>
             <w:r>
               <w:rPr>
+                <w:rFonts w:ascii="Malgun Gothic" w:hAnsi="Malgun Gothic" w:eastAsia="맑은 고딕" w:cs="Malgun Gothic"/>
                 <w:b/>
                 <w:color w:val="FFFFFF"/>
                 <w:sz w:val="18"/>
@@ -632,6 +655,7 @@
             <w:r/>
             <w:r>
               <w:rPr>
+                <w:rFonts w:ascii="Malgun Gothic" w:hAnsi="Malgun Gothic" w:eastAsia="맑은 고딕" w:cs="Malgun Gothic"/>
                 <w:b/>
                 <w:color w:val="FFFFFF"/>
                 <w:sz w:val="18"/>
@@ -652,6 +676,7 @@
             <w:r/>
             <w:r>
               <w:rPr>
+                <w:rFonts w:ascii="Malgun Gothic" w:hAnsi="Malgun Gothic" w:eastAsia="맑은 고딕" w:cs="Malgun Gothic"/>
                 <w:b/>
                 <w:color w:val="FFFFFF"/>
                 <w:sz w:val="18"/>
@@ -672,6 +697,7 @@
             <w:r/>
             <w:r>
               <w:rPr>
+                <w:rFonts w:ascii="Malgun Gothic" w:hAnsi="Malgun Gothic" w:eastAsia="맑은 고딕" w:cs="Malgun Gothic"/>
                 <w:b/>
                 <w:color w:val="FFFFFF"/>
                 <w:sz w:val="18"/>
@@ -692,6 +718,7 @@
             <w:r/>
             <w:r>
               <w:rPr>
+                <w:rFonts w:ascii="Malgun Gothic" w:hAnsi="Malgun Gothic" w:eastAsia="맑은 고딕" w:cs="Malgun Gothic"/>
                 <w:b/>
                 <w:color w:val="FFFFFF"/>
                 <w:sz w:val="18"/>
@@ -710,6 +737,7 @@
             <w:r/>
             <w:r>
               <w:rPr>
+                <w:rFonts w:ascii="Malgun Gothic" w:hAnsi="Malgun Gothic" w:eastAsia="맑은 고딕" w:cs="Malgun Gothic"/>
                 <w:sz w:val="18"/>
               </w:rPr>
               <w:t>[1]</w:t>
@@ -724,6 +752,7 @@
             <w:r/>
             <w:r>
               <w:rPr>
+                <w:rFonts w:ascii="Malgun Gothic" w:hAnsi="Malgun Gothic" w:eastAsia="맑은 고딕" w:cs="Malgun Gothic"/>
                 <w:sz w:val="18"/>
               </w:rPr>
               <w:t>Learning Deep Features for Discriminative Localization</w:t>
@@ -738,6 +767,7 @@
             <w:r/>
             <w:r>
               <w:rPr>
+                <w:rFonts w:ascii="Malgun Gothic" w:hAnsi="Malgun Gothic" w:eastAsia="맑은 고딕" w:cs="Malgun Gothic"/>
                 <w:sz w:val="18"/>
               </w:rPr>
               <w:t>Zhou, Khosla, Lapedriza, Oliva, Torralba</w:t>
@@ -752,6 +782,7 @@
             <w:r/>
             <w:r>
               <w:rPr>
+                <w:rFonts w:ascii="Malgun Gothic" w:hAnsi="Malgun Gothic" w:eastAsia="맑은 고딕" w:cs="Malgun Gothic"/>
                 <w:sz w:val="18"/>
               </w:rPr>
               <w:t>CVPR 2016</w:t>
@@ -766,6 +797,7 @@
             <w:r/>
             <w:r>
               <w:rPr>
+                <w:rFonts w:ascii="Malgun Gothic" w:hAnsi="Malgun Gothic" w:eastAsia="맑은 고딕" w:cs="Malgun Gothic"/>
                 <w:sz w:val="18"/>
               </w:rPr>
               <w:t>CAM 원조 논문. GAP + FC weights로 클래스별 spatial heatmap 생성. Eval4의 per-class attention head는 이 개념의 학습 가능한 확장판으로, CAM이 선형 가중합인 반면 Eval4는 Conv bottleneck + Sigmoid로 더 높은 표현력을 가짐.</w:t>
@@ -783,6 +815,7 @@
             <w:r/>
             <w:r>
               <w:rPr>
+                <w:rFonts w:ascii="Malgun Gothic" w:hAnsi="Malgun Gothic" w:eastAsia="맑은 고딕" w:cs="Malgun Gothic"/>
                 <w:sz w:val="18"/>
               </w:rPr>
               <w:t>[2]</w:t>
@@ -798,6 +831,7 @@
             <w:r/>
             <w:r>
               <w:rPr>
+                <w:rFonts w:ascii="Malgun Gothic" w:hAnsi="Malgun Gothic" w:eastAsia="맑은 고딕" w:cs="Malgun Gothic"/>
                 <w:sz w:val="18"/>
               </w:rPr>
               <w:t>Grad-CAM: Visual Explanations from Deep Networks via Gradient-based Localization</w:t>
@@ -813,6 +847,7 @@
             <w:r/>
             <w:r>
               <w:rPr>
+                <w:rFonts w:ascii="Malgun Gothic" w:hAnsi="Malgun Gothic" w:eastAsia="맑은 고딕" w:cs="Malgun Gothic"/>
                 <w:sz w:val="18"/>
               </w:rPr>
               <w:t>Selvaraju, Cogswell, Das, Vedantam, Parikh, Batra</w:t>
@@ -828,6 +863,7 @@
             <w:r/>
             <w:r>
               <w:rPr>
+                <w:rFonts w:ascii="Malgun Gothic" w:hAnsi="Malgun Gothic" w:eastAsia="맑은 고딕" w:cs="Malgun Gothic"/>
                 <w:sz w:val="18"/>
               </w:rPr>
               <w:t>ICCV 2017</w:t>
@@ -843,6 +879,7 @@
             <w:r/>
             <w:r>
               <w:rPr>
+                <w:rFonts w:ascii="Malgun Gothic" w:hAnsi="Malgun Gothic" w:eastAsia="맑은 고딕" w:cs="Malgun Gothic"/>
                 <w:sz w:val="18"/>
               </w:rPr>
               <w:t>Gradient 기반으로 임의 CNN에서 클래스별 spatial map 생성. Eval4의 attention map이 Grad-CAM과 동일한 역할을 하되, post-hoc이 아닌 forward pass에 내장(baked-in)된 차이점이 있음.</w:t>
@@ -891,6 +928,7 @@
             <w:r/>
             <w:r>
               <w:rPr>
+                <w:rFonts w:ascii="Malgun Gothic" w:hAnsi="Malgun Gothic" w:eastAsia="맑은 고딕" w:cs="Malgun Gothic"/>
                 <w:b/>
                 <w:color w:val="FFFFFF"/>
                 <w:sz w:val="18"/>
@@ -911,6 +949,7 @@
             <w:r/>
             <w:r>
               <w:rPr>
+                <w:rFonts w:ascii="Malgun Gothic" w:hAnsi="Malgun Gothic" w:eastAsia="맑은 고딕" w:cs="Malgun Gothic"/>
                 <w:b/>
                 <w:color w:val="FFFFFF"/>
                 <w:sz w:val="18"/>
@@ -931,6 +970,7 @@
             <w:r/>
             <w:r>
               <w:rPr>
+                <w:rFonts w:ascii="Malgun Gothic" w:hAnsi="Malgun Gothic" w:eastAsia="맑은 고딕" w:cs="Malgun Gothic"/>
                 <w:b/>
                 <w:color w:val="FFFFFF"/>
                 <w:sz w:val="18"/>
@@ -951,6 +991,7 @@
             <w:r/>
             <w:r>
               <w:rPr>
+                <w:rFonts w:ascii="Malgun Gothic" w:hAnsi="Malgun Gothic" w:eastAsia="맑은 고딕" w:cs="Malgun Gothic"/>
                 <w:b/>
                 <w:color w:val="FFFFFF"/>
                 <w:sz w:val="18"/>
@@ -971,6 +1012,7 @@
             <w:r/>
             <w:r>
               <w:rPr>
+                <w:rFonts w:ascii="Malgun Gothic" w:hAnsi="Malgun Gothic" w:eastAsia="맑은 고딕" w:cs="Malgun Gothic"/>
                 <w:b/>
                 <w:color w:val="FFFFFF"/>
                 <w:sz w:val="18"/>
@@ -989,6 +1031,7 @@
             <w:r/>
             <w:r>
               <w:rPr>
+                <w:rFonts w:ascii="Malgun Gothic" w:hAnsi="Malgun Gothic" w:eastAsia="맑은 고딕" w:cs="Malgun Gothic"/>
                 <w:sz w:val="18"/>
               </w:rPr>
               <w:t>[3]</w:t>
@@ -1003,6 +1046,7 @@
             <w:r/>
             <w:r>
               <w:rPr>
+                <w:rFonts w:ascii="Malgun Gothic" w:hAnsi="Malgun Gothic" w:eastAsia="맑은 고딕" w:cs="Malgun Gothic"/>
                 <w:sz w:val="18"/>
               </w:rPr>
               <w:t>Squeeze-and-Excitation Networks (SE-Net)</w:t>
@@ -1017,6 +1061,7 @@
             <w:r/>
             <w:r>
               <w:rPr>
+                <w:rFonts w:ascii="Malgun Gothic" w:hAnsi="Malgun Gothic" w:eastAsia="맑은 고딕" w:cs="Malgun Gothic"/>
                 <w:sz w:val="18"/>
               </w:rPr>
               <w:t>Hu, Shen, Sun</w:t>
@@ -1031,6 +1076,7 @@
             <w:r/>
             <w:r>
               <w:rPr>
+                <w:rFonts w:ascii="Malgun Gothic" w:hAnsi="Malgun Gothic" w:eastAsia="맑은 고딕" w:cs="Malgun Gothic"/>
                 <w:sz w:val="18"/>
               </w:rPr>
               <w:t>CVPR 2018</w:t>
@@ -1045,6 +1091,7 @@
             <w:r/>
             <w:r>
               <w:rPr>
+                <w:rFonts w:ascii="Malgun Gothic" w:hAnsi="Malgun Gothic" w:eastAsia="맑은 고딕" w:cs="Malgun Gothic"/>
                 <w:sz w:val="18"/>
               </w:rPr>
               <w:t>채널 attention의 대표 논문 (ILSVRC 2017 우승). Bottleneck(256→64→1) + Sigmoid 패턴이 Eval4의 attention head와 동일하나, SE-Net은 채널 차원, Eval4는 공간(spatial) 차원에 적용.</w:t>
@@ -1062,6 +1109,7 @@
             <w:r/>
             <w:r>
               <w:rPr>
+                <w:rFonts w:ascii="Malgun Gothic" w:hAnsi="Malgun Gothic" w:eastAsia="맑은 고딕" w:cs="Malgun Gothic"/>
                 <w:sz w:val="18"/>
               </w:rPr>
               <w:t>[4]</w:t>
@@ -1077,6 +1125,7 @@
             <w:r/>
             <w:r>
               <w:rPr>
+                <w:rFonts w:ascii="Malgun Gothic" w:hAnsi="Malgun Gothic" w:eastAsia="맑은 고딕" w:cs="Malgun Gothic"/>
                 <w:sz w:val="18"/>
               </w:rPr>
               <w:t>CBAM: Convolutional Block Attention Module</w:t>
@@ -1092,6 +1141,7 @@
             <w:r/>
             <w:r>
               <w:rPr>
+                <w:rFonts w:ascii="Malgun Gothic" w:hAnsi="Malgun Gothic" w:eastAsia="맑은 고딕" w:cs="Malgun Gothic"/>
                 <w:sz w:val="18"/>
               </w:rPr>
               <w:t>Woo, Park, Lee, Kweon</w:t>
@@ -1107,6 +1157,7 @@
             <w:r/>
             <w:r>
               <w:rPr>
+                <w:rFonts w:ascii="Malgun Gothic" w:hAnsi="Malgun Gothic" w:eastAsia="맑은 고딕" w:cs="Malgun Gothic"/>
                 <w:sz w:val="18"/>
               </w:rPr>
               <w:t>ECCV 2018</w:t>
@@ -1122,6 +1173,7 @@
             <w:r/>
             <w:r>
               <w:rPr>
+                <w:rFonts w:ascii="Malgun Gothic" w:hAnsi="Malgun Gothic" w:eastAsia="맑은 고딕" w:cs="Malgun Gothic"/>
                 <w:sz w:val="18"/>
               </w:rPr>
               <w:t>채널 + 공간 attention 결합. Eval4와 가장 구조적으로 유사 — CBAM의 spatial branch가 Conv로 spatial weight를 생성하는 것과 동일. 차이점: CBAM은 하나의 공유 spatial map, Eval4는 클래스별 독립 spatial map.</w:t>
@@ -1138,6 +1190,7 @@
             <w:r/>
             <w:r>
               <w:rPr>
+                <w:rFonts w:ascii="Malgun Gothic" w:hAnsi="Malgun Gothic" w:eastAsia="맑은 고딕" w:cs="Malgun Gothic"/>
                 <w:sz w:val="18"/>
               </w:rPr>
               <w:t>[5]</w:t>
@@ -1152,6 +1205,7 @@
             <w:r/>
             <w:r>
               <w:rPr>
+                <w:rFonts w:ascii="Malgun Gothic" w:hAnsi="Malgun Gothic" w:eastAsia="맑은 고딕" w:cs="Malgun Gothic"/>
                 <w:sz w:val="18"/>
               </w:rPr>
               <w:t>Residual Attention Network for Image Classification</w:t>
@@ -1166,6 +1220,7 @@
             <w:r/>
             <w:r>
               <w:rPr>
+                <w:rFonts w:ascii="Malgun Gothic" w:hAnsi="Malgun Gothic" w:eastAsia="맑은 고딕" w:cs="Malgun Gothic"/>
                 <w:sz w:val="18"/>
               </w:rPr>
               <w:t>Wang, Jiang, Yang, Wu, Qian, Li</w:t>
@@ -1180,6 +1235,7 @@
             <w:r/>
             <w:r>
               <w:rPr>
+                <w:rFonts w:ascii="Malgun Gothic" w:hAnsi="Malgun Gothic" w:eastAsia="맑은 고딕" w:cs="Malgun Gothic"/>
                 <w:sz w:val="18"/>
               </w:rPr>
               <w:t>CVPR 2017</w:t>
@@ -1194,6 +1250,7 @@
             <w:r/>
             <w:r>
               <w:rPr>
+                <w:rFonts w:ascii="Malgun Gothic" w:hAnsi="Malgun Gothic" w:eastAsia="맑은 고딕" w:cs="Malgun Gothic"/>
                 <w:sz w:val="18"/>
               </w:rPr>
               <w:t>Soft attention(feature × attention_map) 패턴의 근거. Eval4의 f * attn 연산이 이 패턴을 따름.</w:t>
@@ -1242,6 +1299,7 @@
             <w:r/>
             <w:r>
               <w:rPr>
+                <w:rFonts w:ascii="Malgun Gothic" w:hAnsi="Malgun Gothic" w:eastAsia="맑은 고딕" w:cs="Malgun Gothic"/>
                 <w:b/>
                 <w:color w:val="FFFFFF"/>
                 <w:sz w:val="18"/>
@@ -1262,6 +1320,7 @@
             <w:r/>
             <w:r>
               <w:rPr>
+                <w:rFonts w:ascii="Malgun Gothic" w:hAnsi="Malgun Gothic" w:eastAsia="맑은 고딕" w:cs="Malgun Gothic"/>
                 <w:b/>
                 <w:color w:val="FFFFFF"/>
                 <w:sz w:val="18"/>
@@ -1282,6 +1341,7 @@
             <w:r/>
             <w:r>
               <w:rPr>
+                <w:rFonts w:ascii="Malgun Gothic" w:hAnsi="Malgun Gothic" w:eastAsia="맑은 고딕" w:cs="Malgun Gothic"/>
                 <w:b/>
                 <w:color w:val="FFFFFF"/>
                 <w:sz w:val="18"/>
@@ -1302,6 +1362,7 @@
             <w:r/>
             <w:r>
               <w:rPr>
+                <w:rFonts w:ascii="Malgun Gothic" w:hAnsi="Malgun Gothic" w:eastAsia="맑은 고딕" w:cs="Malgun Gothic"/>
                 <w:b/>
                 <w:color w:val="FFFFFF"/>
                 <w:sz w:val="18"/>
@@ -1322,6 +1383,7 @@
             <w:r/>
             <w:r>
               <w:rPr>
+                <w:rFonts w:ascii="Malgun Gothic" w:hAnsi="Malgun Gothic" w:eastAsia="맑은 고딕" w:cs="Malgun Gothic"/>
                 <w:b/>
                 <w:color w:val="FFFFFF"/>
                 <w:sz w:val="18"/>
@@ -1340,6 +1402,7 @@
             <w:r/>
             <w:r>
               <w:rPr>
+                <w:rFonts w:ascii="Malgun Gothic" w:hAnsi="Malgun Gothic" w:eastAsia="맑은 고딕" w:cs="Malgun Gothic"/>
                 <w:sz w:val="18"/>
               </w:rPr>
               <w:t>[6]</w:t>
@@ -1354,6 +1417,7 @@
             <w:r/>
             <w:r>
               <w:rPr>
+                <w:rFonts w:ascii="Malgun Gothic" w:hAnsi="Malgun Gothic" w:eastAsia="맑은 고딕" w:cs="Malgun Gothic"/>
                 <w:sz w:val="18"/>
               </w:rPr>
               <w:t>Weakly Supervised Deep Detection Networks (WSDDN)</w:t>
@@ -1368,6 +1432,7 @@
             <w:r/>
             <w:r>
               <w:rPr>
+                <w:rFonts w:ascii="Malgun Gothic" w:hAnsi="Malgun Gothic" w:eastAsia="맑은 고딕" w:cs="Malgun Gothic"/>
                 <w:sz w:val="18"/>
               </w:rPr>
               <w:t>Bilen, Vedaldi</w:t>
@@ -1382,6 +1447,7 @@
             <w:r/>
             <w:r>
               <w:rPr>
+                <w:rFonts w:ascii="Malgun Gothic" w:hAnsi="Malgun Gothic" w:eastAsia="맑은 고딕" w:cs="Malgun Gothic"/>
                 <w:sz w:val="18"/>
               </w:rPr>
               <w:t>CVPR 2016</w:t>
@@ -1396,6 +1462,7 @@
             <w:r/>
             <w:r>
               <w:rPr>
+                <w:rFonts w:ascii="Malgun Gothic" w:hAnsi="Malgun Gothic" w:eastAsia="맑은 고딕" w:cs="Malgun Gothic"/>
                 <w:sz w:val="18"/>
               </w:rPr>
               <w:t>WSOD 핵심 논문. 이미지 레벨 라벨만으로 classification loss를 통해 공간 선택(spatial selection) 학습 — Eval4의 핵심 원리와 동일. WSDDN은 softmax over regions, Eval4는 sigmoid attention maps 사용.</w:t>
@@ -1413,6 +1480,7 @@
             <w:r/>
             <w:r>
               <w:rPr>
+                <w:rFonts w:ascii="Malgun Gothic" w:hAnsi="Malgun Gothic" w:eastAsia="맑은 고딕" w:cs="Malgun Gothic"/>
                 <w:sz w:val="18"/>
               </w:rPr>
               <w:t>[7]</w:t>
@@ -1428,6 +1496,7 @@
             <w:r/>
             <w:r>
               <w:rPr>
+                <w:rFonts w:ascii="Malgun Gothic" w:hAnsi="Malgun Gothic" w:eastAsia="맑은 고딕" w:cs="Malgun Gothic"/>
                 <w:sz w:val="18"/>
               </w:rPr>
               <w:t>Learning Spatial Regularization with Image-Level Supervisions for Multi-label Image Classification</w:t>
@@ -1443,6 +1512,7 @@
             <w:r/>
             <w:r>
               <w:rPr>
+                <w:rFonts w:ascii="Malgun Gothic" w:hAnsi="Malgun Gothic" w:eastAsia="맑은 고딕" w:cs="Malgun Gothic"/>
                 <w:sz w:val="18"/>
               </w:rPr>
               <w:t>Zhu, Li, Ouyang, Yu, Wang</w:t>
@@ -1458,6 +1528,7 @@
             <w:r/>
             <w:r>
               <w:rPr>
+                <w:rFonts w:ascii="Malgun Gothic" w:hAnsi="Malgun Gothic" w:eastAsia="맑은 고딕" w:cs="Malgun Gothic"/>
                 <w:sz w:val="18"/>
               </w:rPr>
               <w:t>CVPR 2017</w:t>
@@ -1473,6 +1544,7 @@
             <w:r/>
             <w:r>
               <w:rPr>
+                <w:rFonts w:ascii="Malgun Gothic" w:hAnsi="Malgun Gothic" w:eastAsia="맑은 고딕" w:cs="Malgun Gothic"/>
                 <w:sz w:val="18"/>
               </w:rPr>
               <w:t>Eval4와 가장 직접적으로 관련된 논문. 이미지 레벨 라벨로 per-label attention map을 생성하여 multi-label 분류 — 구조적으로 거의 동일한 접근.</w:t>
@@ -1521,6 +1593,7 @@
             <w:r/>
             <w:r>
               <w:rPr>
+                <w:rFonts w:ascii="Malgun Gothic" w:hAnsi="Malgun Gothic" w:eastAsia="맑은 고딕" w:cs="Malgun Gothic"/>
                 <w:b/>
                 <w:color w:val="FFFFFF"/>
                 <w:sz w:val="18"/>
@@ -1541,6 +1614,7 @@
             <w:r/>
             <w:r>
               <w:rPr>
+                <w:rFonts w:ascii="Malgun Gothic" w:hAnsi="Malgun Gothic" w:eastAsia="맑은 고딕" w:cs="Malgun Gothic"/>
                 <w:b/>
                 <w:color w:val="FFFFFF"/>
                 <w:sz w:val="18"/>
@@ -1561,6 +1635,7 @@
             <w:r/>
             <w:r>
               <w:rPr>
+                <w:rFonts w:ascii="Malgun Gothic" w:hAnsi="Malgun Gothic" w:eastAsia="맑은 고딕" w:cs="Malgun Gothic"/>
                 <w:b/>
                 <w:color w:val="FFFFFF"/>
                 <w:sz w:val="18"/>
@@ -1581,6 +1656,7 @@
             <w:r/>
             <w:r>
               <w:rPr>
+                <w:rFonts w:ascii="Malgun Gothic" w:hAnsi="Malgun Gothic" w:eastAsia="맑은 고딕" w:cs="Malgun Gothic"/>
                 <w:b/>
                 <w:color w:val="FFFFFF"/>
                 <w:sz w:val="18"/>
@@ -1601,6 +1677,7 @@
             <w:r/>
             <w:r>
               <w:rPr>
+                <w:rFonts w:ascii="Malgun Gothic" w:hAnsi="Malgun Gothic" w:eastAsia="맑은 고딕" w:cs="Malgun Gothic"/>
                 <w:b/>
                 <w:color w:val="FFFFFF"/>
                 <w:sz w:val="18"/>
@@ -1619,6 +1696,7 @@
             <w:r/>
             <w:r>
               <w:rPr>
+                <w:rFonts w:ascii="Malgun Gothic" w:hAnsi="Malgun Gothic" w:eastAsia="맑은 고딕" w:cs="Malgun Gothic"/>
                 <w:sz w:val="18"/>
               </w:rPr>
               <w:t>[8]</w:t>
@@ -1633,6 +1711,7 @@
             <w:r/>
             <w:r>
               <w:rPr>
+                <w:rFonts w:ascii="Malgun Gothic" w:hAnsi="Malgun Gothic" w:eastAsia="맑은 고딕" w:cs="Malgun Gothic"/>
                 <w:sz w:val="18"/>
               </w:rPr>
               <w:t>Multi-label Image Recognition by Recurrently Discovering Attentional Regions</w:t>
@@ -1647,6 +1726,7 @@
             <w:r/>
             <w:r>
               <w:rPr>
+                <w:rFonts w:ascii="Malgun Gothic" w:hAnsi="Malgun Gothic" w:eastAsia="맑은 고딕" w:cs="Malgun Gothic"/>
                 <w:sz w:val="18"/>
               </w:rPr>
               <w:t>Wang, Chen, Li, Xu, Lin</w:t>
@@ -1661,6 +1741,7 @@
             <w:r/>
             <w:r>
               <w:rPr>
+                <w:rFonts w:ascii="Malgun Gothic" w:hAnsi="Malgun Gothic" w:eastAsia="맑은 고딕" w:cs="Malgun Gothic"/>
                 <w:sz w:val="18"/>
               </w:rPr>
               <w:t>ICCV 2017</w:t>
@@ -1675,6 +1756,7 @@
             <w:r/>
             <w:r>
               <w:rPr>
+                <w:rFonts w:ascii="Malgun Gothic" w:hAnsi="Malgun Gothic" w:eastAsia="맑은 고딕" w:cs="Malgun Gothic"/>
                 <w:sz w:val="18"/>
               </w:rPr>
               <w:t>클래스별 공간 영역을 순차 탐색하여 multi-label 인식. Eval4는 순차적(recurrent) 대신 병렬(parallel) attention head 구조로 동일 목적 달성.</w:t>
@@ -1718,6 +1800,7 @@
             <w:r/>
             <w:r>
               <w:rPr>
+                <w:rFonts w:ascii="Malgun Gothic" w:hAnsi="Malgun Gothic" w:eastAsia="맑은 고딕" w:cs="Malgun Gothic"/>
                 <w:b/>
                 <w:color w:val="FFFFFF"/>
                 <w:sz w:val="18"/>
@@ -1738,6 +1821,7 @@
             <w:r/>
             <w:r>
               <w:rPr>
+                <w:rFonts w:ascii="Malgun Gothic" w:hAnsi="Malgun Gothic" w:eastAsia="맑은 고딕" w:cs="Malgun Gothic"/>
                 <w:b/>
                 <w:color w:val="FFFFFF"/>
                 <w:sz w:val="18"/>
@@ -1758,6 +1842,7 @@
             <w:r/>
             <w:r>
               <w:rPr>
+                <w:rFonts w:ascii="Malgun Gothic" w:hAnsi="Malgun Gothic" w:eastAsia="맑은 고딕" w:cs="Malgun Gothic"/>
                 <w:b/>
                 <w:color w:val="FFFFFF"/>
                 <w:sz w:val="18"/>
@@ -1778,6 +1863,7 @@
             <w:r/>
             <w:r>
               <w:rPr>
+                <w:rFonts w:ascii="Malgun Gothic" w:hAnsi="Malgun Gothic" w:eastAsia="맑은 고딕" w:cs="Malgun Gothic"/>
                 <w:b/>
                 <w:color w:val="FFFFFF"/>
                 <w:sz w:val="18"/>
@@ -1798,6 +1884,7 @@
             <w:r/>
             <w:r>
               <w:rPr>
+                <w:rFonts w:ascii="Malgun Gothic" w:hAnsi="Malgun Gothic" w:eastAsia="맑은 고딕" w:cs="Malgun Gothic"/>
                 <w:b/>
                 <w:color w:val="FFFFFF"/>
                 <w:sz w:val="18"/>
@@ -1816,6 +1903,7 @@
             <w:r/>
             <w:r>
               <w:rPr>
+                <w:rFonts w:ascii="Malgun Gothic" w:hAnsi="Malgun Gothic" w:eastAsia="맑은 고딕" w:cs="Malgun Gothic"/>
                 <w:sz w:val="18"/>
               </w:rPr>
               <w:t>[9]</w:t>
@@ -1830,6 +1918,7 @@
             <w:r/>
             <w:r>
               <w:rPr>
+                <w:rFonts w:ascii="Malgun Gothic" w:hAnsi="Malgun Gothic" w:eastAsia="맑은 고딕" w:cs="Malgun Gothic"/>
                 <w:sz w:val="18"/>
               </w:rPr>
               <w:t>Weakly Supervised Object Localization and Detection: A Survey</w:t>
@@ -1844,6 +1933,7 @@
             <w:r/>
             <w:r>
               <w:rPr>
+                <w:rFonts w:ascii="Malgun Gothic" w:hAnsi="Malgun Gothic" w:eastAsia="맑은 고딕" w:cs="Malgun Gothic"/>
                 <w:sz w:val="18"/>
               </w:rPr>
               <w:t>Zhang et al.</w:t>
@@ -1858,6 +1948,7 @@
             <w:r/>
             <w:r>
               <w:rPr>
+                <w:rFonts w:ascii="Malgun Gothic" w:hAnsi="Malgun Gothic" w:eastAsia="맑은 고딕" w:cs="Malgun Gothic"/>
                 <w:sz w:val="18"/>
               </w:rPr>
               <w:t>IEEE TPAMI 2022</w:t>
@@ -1872,6 +1963,7 @@
             <w:r/>
             <w:r>
               <w:rPr>
+                <w:rFonts w:ascii="Malgun Gothic" w:hAnsi="Malgun Gothic" w:eastAsia="맑은 고딕" w:cs="Malgun Gothic"/>
                 <w:sz w:val="18"/>
               </w:rPr>
               <w:t>WSOL/WSOD 기법 종합 서베이. Eval4의 학술적 위치를 정의하는 데 인용 가능. WSOL과 WSOD의 엄밀한 정의를 제공.</w:t>
@@ -1933,6 +2025,7 @@
             <w:r/>
             <w:r>
               <w:rPr>
+                <w:rFonts w:ascii="Malgun Gothic" w:hAnsi="Malgun Gothic" w:eastAsia="맑은 고딕" w:cs="Malgun Gothic"/>
                 <w:b/>
                 <w:color w:val="FFFFFF"/>
                 <w:sz w:val="18"/>
@@ -1953,6 +2046,7 @@
             <w:r/>
             <w:r>
               <w:rPr>
+                <w:rFonts w:ascii="Malgun Gothic" w:hAnsi="Malgun Gothic" w:eastAsia="맑은 고딕" w:cs="Malgun Gothic"/>
                 <w:b/>
                 <w:color w:val="FFFFFF"/>
                 <w:sz w:val="18"/>
@@ -1973,6 +2067,7 @@
             <w:r/>
             <w:r>
               <w:rPr>
+                <w:rFonts w:ascii="Malgun Gothic" w:hAnsi="Malgun Gothic" w:eastAsia="맑은 고딕" w:cs="Malgun Gothic"/>
                 <w:b/>
                 <w:color w:val="FFFFFF"/>
                 <w:sz w:val="18"/>
@@ -1993,6 +2088,7 @@
             <w:r/>
             <w:r>
               <w:rPr>
+                <w:rFonts w:ascii="Malgun Gothic" w:hAnsi="Malgun Gothic" w:eastAsia="맑은 고딕" w:cs="Malgun Gothic"/>
                 <w:b/>
                 <w:color w:val="FFFFFF"/>
                 <w:sz w:val="18"/>
@@ -2013,6 +2109,7 @@
             <w:r/>
             <w:r>
               <w:rPr>
+                <w:rFonts w:ascii="Malgun Gothic" w:hAnsi="Malgun Gothic" w:eastAsia="맑은 고딕" w:cs="Malgun Gothic"/>
                 <w:b/>
                 <w:color w:val="FFFFFF"/>
                 <w:sz w:val="18"/>
@@ -2031,6 +2128,7 @@
             <w:r/>
             <w:r>
               <w:rPr>
+                <w:rFonts w:ascii="Malgun Gothic" w:hAnsi="Malgun Gothic" w:eastAsia="맑은 고딕" w:cs="Malgun Gothic"/>
                 <w:sz w:val="18"/>
               </w:rPr>
               <w:t>Object Detection</w:t>
@@ -2047,6 +2145,7 @@
             <w:r/>
             <w:r>
               <w:rPr>
+                <w:rFonts w:ascii="Malgun Gothic" w:hAnsi="Malgun Gothic" w:eastAsia="맑은 고딕" w:cs="Malgun Gothic"/>
                 <w:sz w:val="18"/>
               </w:rPr>
               <w:t>BBox regression +</w:t>
@@ -2063,6 +2162,7 @@
             <w:r/>
             <w:r>
               <w:rPr>
+                <w:rFonts w:ascii="Malgun Gothic" w:hAnsi="Malgun Gothic" w:eastAsia="맑은 고딕" w:cs="Malgun Gothic"/>
                 <w:sz w:val="18"/>
               </w:rPr>
               <w:t>BBox 좌표 +</w:t>
@@ -2079,6 +2179,7 @@
             <w:r/>
             <w:r>
               <w:rPr>
+                <w:rFonts w:ascii="Malgun Gothic" w:hAnsi="Malgun Gothic" w:eastAsia="맑은 고딕" w:cs="Malgun Gothic"/>
                 <w:sz w:val="18"/>
               </w:rPr>
               <w:t>(x,y,w,h) +</w:t>
@@ -2095,6 +2196,7 @@
             <w:r/>
             <w:r>
               <w:rPr>
+                <w:rFonts w:ascii="Malgun Gothic" w:hAnsi="Malgun Gothic" w:eastAsia="맑은 고딕" w:cs="Malgun Gothic"/>
                 <w:sz w:val="18"/>
               </w:rPr>
               <w:t>해당 없음</w:t>
@@ -2112,6 +2214,7 @@
             <w:r/>
             <w:r>
               <w:rPr>
+                <w:rFonts w:ascii="Malgun Gothic" w:hAnsi="Malgun Gothic" w:eastAsia="맑은 고딕" w:cs="Malgun Gothic"/>
                 <w:sz w:val="18"/>
               </w:rPr>
               <w:t>WSOL</w:t>
@@ -2131,6 +2234,7 @@
             <w:r/>
             <w:r>
               <w:rPr>
+                <w:rFonts w:ascii="Malgun Gothic" w:hAnsi="Malgun Gothic" w:eastAsia="맑은 고딕" w:cs="Malgun Gothic"/>
                 <w:sz w:val="18"/>
               </w:rPr>
               <w:t>이미지 라벨로</w:t>
@@ -2148,6 +2252,7 @@
             <w:r/>
             <w:r>
               <w:rPr>
+                <w:rFonts w:ascii="Malgun Gothic" w:hAnsi="Malgun Gothic" w:eastAsia="맑은 고딕" w:cs="Malgun Gothic"/>
                 <w:sz w:val="18"/>
               </w:rPr>
               <w:t>이미지 레벨</w:t>
@@ -2165,6 +2270,7 @@
             <w:r/>
             <w:r>
               <w:rPr>
+                <w:rFonts w:ascii="Malgun Gothic" w:hAnsi="Malgun Gothic" w:eastAsia="맑은 고딕" w:cs="Malgun Gothic"/>
                 <w:sz w:val="18"/>
               </w:rPr>
               <w:t>Heatmap /</w:t>
@@ -2182,6 +2288,7 @@
             <w:r/>
             <w:r>
               <w:rPr>
+                <w:rFonts w:ascii="Malgun Gothic" w:hAnsi="Malgun Gothic" w:eastAsia="맑은 고딕" w:cs="Malgun Gothic"/>
                 <w:sz w:val="18"/>
               </w:rPr>
               <w:t>부분 해당</w:t>
@@ -2198,6 +2305,7 @@
             <w:r/>
             <w:r>
               <w:rPr>
+                <w:rFonts w:ascii="Malgun Gothic" w:hAnsi="Malgun Gothic" w:eastAsia="맑은 고딕" w:cs="Malgun Gothic"/>
                 <w:sz w:val="18"/>
               </w:rPr>
               <w:t>WSOD</w:t>
@@ -2216,6 +2324,7 @@
             <w:r/>
             <w:r>
               <w:rPr>
+                <w:rFonts w:ascii="Malgun Gothic" w:hAnsi="Malgun Gothic" w:eastAsia="맑은 고딕" w:cs="Malgun Gothic"/>
                 <w:sz w:val="18"/>
               </w:rPr>
               <w:t>이미지 라벨로</w:t>
@@ -2232,6 +2341,7 @@
             <w:r/>
             <w:r>
               <w:rPr>
+                <w:rFonts w:ascii="Malgun Gothic" w:hAnsi="Malgun Gothic" w:eastAsia="맑은 고딕" w:cs="Malgun Gothic"/>
                 <w:sz w:val="18"/>
               </w:rPr>
               <w:t>이미지 레벨</w:t>
@@ -2248,6 +2358,7 @@
             <w:r/>
             <w:r>
               <w:rPr>
+                <w:rFonts w:ascii="Malgun Gothic" w:hAnsi="Malgun Gothic" w:eastAsia="맑은 고딕" w:cs="Malgun Gothic"/>
                 <w:sz w:val="18"/>
               </w:rPr>
               <w:t>BBox +</w:t>
@@ -2264,6 +2375,7 @@
             <w:r/>
             <w:r>
               <w:rPr>
+                <w:rFonts w:ascii="Malgun Gothic" w:hAnsi="Malgun Gothic" w:eastAsia="맑은 고딕" w:cs="Malgun Gothic"/>
                 <w:sz w:val="18"/>
               </w:rPr>
               <w:t>부분 해당</w:t>
@@ -2281,6 +2393,7 @@
             <w:r/>
             <w:r>
               <w:rPr>
+                <w:rFonts w:ascii="Malgun Gothic" w:hAnsi="Malgun Gothic" w:eastAsia="맑은 고딕" w:cs="Malgun Gothic"/>
                 <w:sz w:val="18"/>
               </w:rPr>
               <w:t>Attention-based</w:t>
@@ -2300,6 +2413,7 @@
             <w:r/>
             <w:r>
               <w:rPr>
+                <w:rFonts w:ascii="Malgun Gothic" w:hAnsi="Malgun Gothic" w:eastAsia="맑은 고딕" w:cs="Malgun Gothic"/>
                 <w:sz w:val="18"/>
               </w:rPr>
               <w:t>클래스별 attention으로</w:t>
@@ -2317,6 +2431,7 @@
             <w:r/>
             <w:r>
               <w:rPr>
+                <w:rFonts w:ascii="Malgun Gothic" w:hAnsi="Malgun Gothic" w:eastAsia="맑은 고딕" w:cs="Malgun Gothic"/>
                 <w:sz w:val="18"/>
               </w:rPr>
               <w:t>이미지 레벨</w:t>
@@ -2334,6 +2449,7 @@
             <w:r/>
             <w:r>
               <w:rPr>
+                <w:rFonts w:ascii="Malgun Gothic" w:hAnsi="Malgun Gothic" w:eastAsia="맑은 고딕" w:cs="Malgun Gothic"/>
                 <w:sz w:val="18"/>
               </w:rPr>
               <w:t>Heatmap +</w:t>
@@ -2351,6 +2467,7 @@
             <w:r/>
             <w:r>
               <w:rPr>
+                <w:rFonts w:ascii="Malgun Gothic" w:hAnsi="Malgun Gothic" w:eastAsia="맑은 고딕" w:cs="Malgun Gothic"/>
                 <w:sz w:val="18"/>
               </w:rPr>
               <w:t>해당</w:t>
@@ -2363,6 +2480,7 @@
     <w:p>
       <w:r>
         <w:rPr>
+          <w:rFonts w:ascii="Malgun Gothic" w:hAnsi="Malgun Gothic" w:eastAsia="맑은 고딕" w:cs="Malgun Gothic"/>
           <w:b/>
         </w:rPr>
         <w:t>결론: Eval 4 모델은 "Attention-based Multi-label Classification with Implicit Spatial Localization" 범주에 가장 정확하게 해당하며, WSOL/WSOD의 특성을 부분적으로 공유합니다.</w:t>
@@ -2379,6 +2497,7 @@
     <w:p>
       <w:r>
         <w:rPr>
+          <w:rFonts w:ascii="Malgun Gothic" w:hAnsi="Malgun Gothic" w:eastAsia="맑은 고딕" w:cs="Malgun Gothic"/>
           <w:b/>
           <w:sz w:val="20"/>
         </w:rPr>
@@ -2393,6 +2512,7 @@
     <w:p>
       <w:r>
         <w:rPr>
+          <w:rFonts w:ascii="Malgun Gothic" w:hAnsi="Malgun Gothic" w:eastAsia="맑은 고딕" w:cs="Malgun Gothic"/>
           <w:b/>
           <w:sz w:val="20"/>
         </w:rPr>
@@ -2407,6 +2527,7 @@
     <w:p>
       <w:r>
         <w:rPr>
+          <w:rFonts w:ascii="Malgun Gothic" w:hAnsi="Malgun Gothic" w:eastAsia="맑은 고딕" w:cs="Malgun Gothic"/>
           <w:b/>
           <w:sz w:val="20"/>
         </w:rPr>
@@ -2421,6 +2542,7 @@
     <w:p>
       <w:r>
         <w:rPr>
+          <w:rFonts w:ascii="Malgun Gothic" w:hAnsi="Malgun Gothic" w:eastAsia="맑은 고딕" w:cs="Malgun Gothic"/>
           <w:b/>
           <w:sz w:val="20"/>
         </w:rPr>
@@ -2435,6 +2557,7 @@
     <w:p>
       <w:r>
         <w:rPr>
+          <w:rFonts w:ascii="Malgun Gothic" w:hAnsi="Malgun Gothic" w:eastAsia="맑은 고딕" w:cs="Malgun Gothic"/>
           <w:b/>
           <w:sz w:val="20"/>
         </w:rPr>
@@ -2457,6 +2580,7 @@
     <w:p>
       <w:r>
         <w:rPr>
+          <w:rFonts w:ascii="Malgun Gothic" w:hAnsi="Malgun Gothic" w:eastAsia="맑은 고딕" w:cs="Malgun Gothic"/>
           <w:b/>
           <w:sz w:val="20"/>
         </w:rPr>
@@ -2471,6 +2595,7 @@
     <w:p>
       <w:r>
         <w:rPr>
+          <w:rFonts w:ascii="Malgun Gothic" w:hAnsi="Malgun Gothic" w:eastAsia="맑은 고딕" w:cs="Malgun Gothic"/>
           <w:b/>
           <w:sz w:val="20"/>
         </w:rPr>
@@ -2485,6 +2610,7 @@
     <w:p>
       <w:r>
         <w:rPr>
+          <w:rFonts w:ascii="Malgun Gothic" w:hAnsi="Malgun Gothic" w:eastAsia="맑은 고딕" w:cs="Malgun Gothic"/>
           <w:b/>
           <w:sz w:val="20"/>
         </w:rPr>
@@ -2529,6 +2655,7 @@
             <w:r/>
             <w:r>
               <w:rPr>
+                <w:rFonts w:ascii="Malgun Gothic" w:hAnsi="Malgun Gothic" w:eastAsia="맑은 고딕" w:cs="Malgun Gothic"/>
                 <w:b/>
                 <w:color w:val="FFFFFF"/>
                 <w:sz w:val="18"/>
@@ -2549,6 +2676,7 @@
             <w:r/>
             <w:r>
               <w:rPr>
+                <w:rFonts w:ascii="Malgun Gothic" w:hAnsi="Malgun Gothic" w:eastAsia="맑은 고딕" w:cs="Malgun Gothic"/>
                 <w:b/>
                 <w:color w:val="FFFFFF"/>
                 <w:sz w:val="18"/>
@@ -2569,6 +2697,7 @@
             <w:r/>
             <w:r>
               <w:rPr>
+                <w:rFonts w:ascii="Malgun Gothic" w:hAnsi="Malgun Gothic" w:eastAsia="맑은 고딕" w:cs="Malgun Gothic"/>
                 <w:b/>
                 <w:color w:val="FFFFFF"/>
                 <w:sz w:val="18"/>
@@ -2587,6 +2716,7 @@
             <w:r/>
             <w:r>
               <w:rPr>
+                <w:rFonts w:ascii="Malgun Gothic" w:hAnsi="Malgun Gothic" w:eastAsia="맑은 고딕" w:cs="Malgun Gothic"/>
                 <w:sz w:val="18"/>
               </w:rPr>
               <w:t>논문 / 공식 보고서</w:t>
@@ -2601,6 +2731,7 @@
             <w:r/>
             <w:r>
               <w:rPr>
+                <w:rFonts w:ascii="Malgun Gothic" w:hAnsi="Malgun Gothic" w:eastAsia="맑은 고딕" w:cs="Malgun Gothic"/>
                 <w:sz w:val="18"/>
               </w:rPr>
               <w:t>Weakly-supervised multi-label classification</w:t>
@@ -2617,6 +2748,7 @@
             <w:r/>
             <w:r>
               <w:rPr>
+                <w:rFonts w:ascii="Malgun Gothic" w:hAnsi="Malgun Gothic" w:eastAsia="맑은 고딕" w:cs="Malgun Gothic"/>
                 <w:sz w:val="18"/>
               </w:rPr>
               <w:t>가장 학술적으로 정확한 표현</w:t>
@@ -2634,6 +2766,7 @@
             <w:r/>
             <w:r>
               <w:rPr>
+                <w:rFonts w:ascii="Malgun Gothic" w:hAnsi="Malgun Gothic" w:eastAsia="맑은 고딕" w:cs="Malgun Gothic"/>
                 <w:sz w:val="18"/>
               </w:rPr>
               <w:t>기술 보고서 (간결)</w:t>
@@ -2649,6 +2782,7 @@
             <w:r/>
             <w:r>
               <w:rPr>
+                <w:rFonts w:ascii="Malgun Gothic" w:hAnsi="Malgun Gothic" w:eastAsia="맑은 고딕" w:cs="Malgun Gothic"/>
                 <w:sz w:val="18"/>
               </w:rPr>
               <w:t>Attention-based weakly-supervised</w:t>
@@ -2666,6 +2800,7 @@
             <w:r/>
             <w:r>
               <w:rPr>
+                <w:rFonts w:ascii="Malgun Gothic" w:hAnsi="Malgun Gothic" w:eastAsia="맑은 고딕" w:cs="Malgun Gothic"/>
                 <w:sz w:val="18"/>
               </w:rPr>
               <w:t>Localization 능력을 강조</w:t>
@@ -2682,6 +2817,7 @@
             <w:r/>
             <w:r>
               <w:rPr>
+                <w:rFonts w:ascii="Malgun Gothic" w:hAnsi="Malgun Gothic" w:eastAsia="맑은 고딕" w:cs="Malgun Gothic"/>
                 <w:sz w:val="18"/>
               </w:rPr>
               <w:t>내부 / 구두 소통</w:t>
@@ -2696,6 +2832,7 @@
             <w:r/>
             <w:r>
               <w:rPr>
+                <w:rFonts w:ascii="Malgun Gothic" w:hAnsi="Malgun Gothic" w:eastAsia="맑은 고딕" w:cs="Malgun Gothic"/>
                 <w:sz w:val="18"/>
               </w:rPr>
               <w:t>Detection 모델</w:t>
@@ -2710,6 +2847,7 @@
             <w:r/>
             <w:r>
               <w:rPr>
+                <w:rFonts w:ascii="Malgun Gothic" w:hAnsi="Malgun Gothic" w:eastAsia="맑은 고딕" w:cs="Malgun Gothic"/>
                 <w:sz w:val="18"/>
               </w:rPr>
               <w:t>실용적으로 문제없음.</w:t>
@@ -2743,44 +2881,60 @@
     <w:p>
       <w:r>
         <w:rPr>
+          <w:rFonts w:ascii="Malgun Gothic" w:hAnsi="Malgun Gothic" w:eastAsia="맑은 고딕" w:cs="Malgun Gothic"/>
           <w:b/>
         </w:rPr>
         <w:t xml:space="preserve">1. </w:t>
       </w:r>
       <w:r>
+        <w:rPr>
+          <w:rFonts w:ascii="Malgun Gothic" w:hAnsi="Malgun Gothic" w:eastAsia="맑은 고딕" w:cs="Malgun Gothic"/>
+        </w:rPr>
         <w:t>CAM(Zhou et al., 2016)의 학습 가능한 확장판으로, 클래스별 독립적인 spatial attention을 forward pass에 내장하여 post-hoc 시각화 없이도 모델의 판단 근거를 제공합니다.</w:t>
       </w:r>
     </w:p>
     <w:p>
       <w:r>
         <w:rPr>
+          <w:rFonts w:ascii="Malgun Gothic" w:hAnsi="Malgun Gothic" w:eastAsia="맑은 고딕" w:cs="Malgun Gothic"/>
           <w:b/>
         </w:rPr>
         <w:t xml:space="preserve">2. </w:t>
       </w:r>
       <w:r>
+        <w:rPr>
+          <w:rFonts w:ascii="Malgun Gothic" w:hAnsi="Malgun Gothic" w:eastAsia="맑은 고딕" w:cs="Malgun Gothic"/>
+        </w:rPr>
         <w:t>CBAM(Woo et al., 2018)의 spatial attention branch와 구조적으로 유사하나, 클래스별 독립 attention head를 사용하여 multi-label 환경에서 공간 분리를 달성합니다.</w:t>
       </w:r>
     </w:p>
     <w:p>
       <w:r>
         <w:rPr>
+          <w:rFonts w:ascii="Malgun Gothic" w:hAnsi="Malgun Gothic" w:eastAsia="맑은 고딕" w:cs="Malgun Gothic"/>
           <w:b/>
         </w:rPr>
         <w:t xml:space="preserve">3. </w:t>
       </w:r>
       <w:r>
+        <w:rPr>
+          <w:rFonts w:ascii="Malgun Gothic" w:hAnsi="Malgun Gothic" w:eastAsia="맑은 고딕" w:cs="Malgun Gothic"/>
+        </w:rPr>
         <w:t>WSDDN(Bilen et al., 2016) 및 Zhu et al.(2017)과 동일한 원리로, 이미지 레벨 라벨만으로 공간적 localization을 학습하는 weakly-supervised 방식입니다.</w:t>
       </w:r>
     </w:p>
     <w:p>
       <w:r>
         <w:rPr>
+          <w:rFonts w:ascii="Malgun Gothic" w:hAnsi="Malgun Gothic" w:eastAsia="맑은 고딕" w:cs="Malgun Gothic"/>
           <w:b/>
         </w:rPr>
         <w:t xml:space="preserve">4. </w:t>
       </w:r>
       <w:r>
+        <w:rPr>
+          <w:rFonts w:ascii="Malgun Gothic" w:hAnsi="Malgun Gothic" w:eastAsia="맑은 고딕" w:cs="Malgun Gothic"/>
+        </w:rPr>
         <w:t>엄밀한 의미의 Object Detection(bbox regression)은 아니지만, 공간 위치를 식별하고 클래스별 독립 탐지를 수행한다는 점에서 "Weakly-Supervised Detection"이라는 명칭이 학술적으로 타당합니다.</w:t>
       </w:r>
     </w:p>
@@ -2788,6 +2942,7 @@
     <w:p>
       <w:r>
         <w:rPr>
+          <w:rFonts w:ascii="Malgun Gothic" w:hAnsi="Malgun Gothic" w:eastAsia="맑은 고딕" w:cs="Malgun Gothic"/>
           <w:i/>
         </w:rPr>
         <w:t>향후 BBox 라벨을 추가하여 학습할 경우, 정통 Object Detection으로의 확장이 가능하며, 이 경우 더 정확한 공간 localization과 인스턴스 수준의 탐지가 기대됩니다.</w:t>
@@ -2808,6 +2963,7 @@
       </w:pPr>
       <w:r>
         <w:rPr>
+          <w:rFonts w:ascii="Malgun Gothic" w:hAnsi="Malgun Gothic" w:eastAsia="맑은 고딕" w:cs="Malgun Gothic"/>
           <w:sz w:val="18"/>
         </w:rPr>
         <w:t>[1] Zhou, B., Khosla, A., Lapedriza, A., Oliva, A., &amp; Torralba, A. (2016). "Learning Deep Features for Discriminative Localization." CVPR 2016.</w:t>
@@ -2820,6 +2976,7 @@
       </w:pPr>
       <w:r>
         <w:rPr>
+          <w:rFonts w:ascii="Malgun Gothic" w:hAnsi="Malgun Gothic" w:eastAsia="맑은 고딕" w:cs="Malgun Gothic"/>
           <w:sz w:val="18"/>
         </w:rPr>
         <w:t>[2] Selvaraju, R. R., Cogswell, M., Das, A., Vedantam, R., Parikh, D., &amp; Batra, D. (2017). "Grad-CAM: Visual Explanations from Deep Networks via Gradient-based Localization." ICCV 2017.</w:t>
@@ -2832,6 +2989,7 @@
       </w:pPr>
       <w:r>
         <w:rPr>
+          <w:rFonts w:ascii="Malgun Gothic" w:hAnsi="Malgun Gothic" w:eastAsia="맑은 고딕" w:cs="Malgun Gothic"/>
           <w:sz w:val="18"/>
         </w:rPr>
         <w:t>[3] Hu, J., Shen, L., &amp; Sun, G. (2018). "Squeeze-and-Excitation Networks." CVPR 2018.</w:t>
@@ -2844,6 +3002,7 @@
       </w:pPr>
       <w:r>
         <w:rPr>
+          <w:rFonts w:ascii="Malgun Gothic" w:hAnsi="Malgun Gothic" w:eastAsia="맑은 고딕" w:cs="Malgun Gothic"/>
           <w:sz w:val="18"/>
         </w:rPr>
         <w:t>[4] Woo, S., Park, J., Lee, J.-Y., &amp; Kweon, I. S. (2018). "CBAM: Convolutional Block Attention Module." ECCV 2018.</w:t>
@@ -2856,6 +3015,7 @@
       </w:pPr>
       <w:r>
         <w:rPr>
+          <w:rFonts w:ascii="Malgun Gothic" w:hAnsi="Malgun Gothic" w:eastAsia="맑은 고딕" w:cs="Malgun Gothic"/>
           <w:sz w:val="18"/>
         </w:rPr>
         <w:t>[5] Wang, F., Jiang, M., Qian, C., Yang, S., Li, C., Zhang, H., Wang, X., &amp; Tang, X. (2017). "Residual Attention Network for Image Classification." CVPR 2017.</w:t>
@@ -2868,6 +3028,7 @@
       </w:pPr>
       <w:r>
         <w:rPr>
+          <w:rFonts w:ascii="Malgun Gothic" w:hAnsi="Malgun Gothic" w:eastAsia="맑은 고딕" w:cs="Malgun Gothic"/>
           <w:sz w:val="18"/>
         </w:rPr>
         <w:t>[6] Bilen, H. &amp; Vedaldi, A. (2016). "Weakly Supervised Deep Detection Networks." CVPR 2016.</w:t>
@@ -2880,6 +3041,7 @@
       </w:pPr>
       <w:r>
         <w:rPr>
+          <w:rFonts w:ascii="Malgun Gothic" w:hAnsi="Malgun Gothic" w:eastAsia="맑은 고딕" w:cs="Malgun Gothic"/>
           <w:sz w:val="18"/>
         </w:rPr>
         <w:t>[7] Zhu, F., Li, H., Ouyang, W., Yu, N., &amp; Wang, X. (2017). "Learning Spatial Regularization with Image-Level Supervisions for Multi-label Image Classification." CVPR 2017.</w:t>
@@ -2892,6 +3054,7 @@
       </w:pPr>
       <w:r>
         <w:rPr>
+          <w:rFonts w:ascii="Malgun Gothic" w:hAnsi="Malgun Gothic" w:eastAsia="맑은 고딕" w:cs="Malgun Gothic"/>
           <w:sz w:val="18"/>
         </w:rPr>
         <w:t>[8] Wang, Z., Chen, T., Li, G., Xu, R., &amp; Lin, L. (2017). "Multi-label Image Recognition by Recurrently Discovering Attentional Regions." ICCV 2017.</w:t>
@@ -2904,6 +3067,7 @@
       </w:pPr>
       <w:r>
         <w:rPr>
+          <w:rFonts w:ascii="Malgun Gothic" w:hAnsi="Malgun Gothic" w:eastAsia="맑은 고딕" w:cs="Malgun Gothic"/>
           <w:sz w:val="18"/>
         </w:rPr>
         <w:t>[9] Zhang, D. et al. (2022). "Weakly Supervised Object Localization and Detection: A Survey." IEEE TPAMI 2022.</w:t>
@@ -3286,7 +3450,7 @@
       <w:spacing w:after="80" w:line="276" w:lineRule="auto"/>
     </w:pPr>
     <w:rPr>
-      <w:rFonts w:ascii="맑은 고딕" w:hAnsi="맑은 고딕"/>
+      <w:rFonts w:ascii="Malgun Gothic" w:hAnsi="Malgun Gothic" w:eastAsia="맑은 고딕" w:cs="Malgun Gothic"/>
       <w:sz w:val="20"/>
     </w:rPr>
   </w:style>
@@ -3349,7 +3513,7 @@
       <w:outlineLvl w:val="0"/>
     </w:pPr>
     <w:rPr>
-      <w:rFonts w:asciiTheme="majorHAnsi" w:eastAsiaTheme="majorEastAsia" w:hAnsiTheme="majorHAnsi" w:cstheme="majorBidi" w:ascii="맑은 고딕" w:hAnsi="맑은 고딕"/>
+      <w:rFonts w:asciiTheme="majorHAnsi" w:eastAsiaTheme="majorEastAsia" w:hAnsiTheme="majorHAnsi" w:cstheme="majorBidi" w:ascii="Malgun Gothic" w:hAnsi="Malgun Gothic" w:eastAsia="맑은 고딕" w:cs="Malgun Gothic"/>
       <w:b/>
       <w:bCs/>
       <w:color w:val="1A1A2E"/>
@@ -3373,7 +3537,7 @@
       <w:outlineLvl w:val="1"/>
     </w:pPr>
     <w:rPr>
-      <w:rFonts w:asciiTheme="majorHAnsi" w:eastAsiaTheme="majorEastAsia" w:hAnsiTheme="majorHAnsi" w:cstheme="majorBidi" w:ascii="맑은 고딕" w:hAnsi="맑은 고딕"/>
+      <w:rFonts w:asciiTheme="majorHAnsi" w:eastAsiaTheme="majorEastAsia" w:hAnsiTheme="majorHAnsi" w:cstheme="majorBidi" w:ascii="Malgun Gothic" w:hAnsi="Malgun Gothic" w:eastAsia="맑은 고딕" w:cs="Malgun Gothic"/>
       <w:b/>
       <w:bCs/>
       <w:color w:val="1A1A2E"/>
@@ -3397,7 +3561,7 @@
       <w:outlineLvl w:val="2"/>
     </w:pPr>
     <w:rPr>
-      <w:rFonts w:asciiTheme="majorHAnsi" w:eastAsiaTheme="majorEastAsia" w:hAnsiTheme="majorHAnsi" w:cstheme="majorBidi" w:ascii="맑은 고딕" w:hAnsi="맑은 고딕"/>
+      <w:rFonts w:asciiTheme="majorHAnsi" w:eastAsiaTheme="majorEastAsia" w:hAnsiTheme="majorHAnsi" w:cstheme="majorBidi" w:ascii="Malgun Gothic" w:hAnsi="Malgun Gothic" w:eastAsia="맑은 고딕" w:cs="Malgun Gothic"/>
       <w:b/>
       <w:bCs/>
       <w:color w:val="1A1A2E"/>

</xml_diff>